<commit_message>
Fixes -delete sync -manual -instancing new forms
</commit_message>
<xml_diff>
--- a/Ticket Designer System User Manual.docx
+++ b/Ticket Designer System User Manual.docx
@@ -22,18 +22,70 @@
           <w:sz w:val="44"/>
           <w:szCs w:val="44"/>
         </w:rPr>
-        <w:t>Ticket Designer System User Manual</w:t>
-      </w:r>
-    </w:p>
-    <w:p>
-      <w:pPr>
-        <w:jc w:val="center"/>
-        <w:rPr>
-          <w:sz w:val="28"/>
-          <w:szCs w:val="28"/>
-        </w:rPr>
-      </w:pPr>
-    </w:p>
+        <w:t xml:space="preserve">Ticket Designer System </w:t>
+      </w:r>
+      <w:commentRangeStart w:id="0"/>
+      <w:r>
+        <w:rPr>
+          <w:b/>
+          <w:bCs/>
+          <w:color w:val="000000" w:themeColor="text1"/>
+          <w:sz w:val="44"/>
+          <w:szCs w:val="44"/>
+        </w:rPr>
+        <w:t>User</w:t>
+      </w:r>
+      <w:commentRangeEnd w:id="0"/>
+      <w:r>
+        <w:rPr>
+          <w:rStyle w:val="CommentReference"/>
+          <w:rFonts w:asciiTheme="minorHAnsi" w:eastAsiaTheme="minorHAnsi" w:hAnsiTheme="minorHAnsi" w:cstheme="minorBidi"/>
+          <w:color w:val="auto"/>
+        </w:rPr>
+        <w:commentReference w:id="0"/>
+      </w:r>
+      <w:r>
+        <w:rPr>
+          <w:b/>
+          <w:bCs/>
+          <w:color w:val="000000" w:themeColor="text1"/>
+          <w:sz w:val="44"/>
+          <w:szCs w:val="44"/>
+        </w:rPr>
+        <w:t>’s</w:t>
+      </w:r>
+      <w:r>
+        <w:rPr>
+          <w:b/>
+          <w:bCs/>
+          <w:color w:val="000000" w:themeColor="text1"/>
+          <w:sz w:val="44"/>
+          <w:szCs w:val="44"/>
+        </w:rPr>
+        <w:t xml:space="preserve"> </w:t>
+      </w:r>
+      <w:commentRangeStart w:id="1"/>
+      <w:r>
+        <w:rPr>
+          <w:b/>
+          <w:bCs/>
+          <w:color w:val="000000" w:themeColor="text1"/>
+          <w:sz w:val="44"/>
+          <w:szCs w:val="44"/>
+        </w:rPr>
+        <w:t>Manual</w:t>
+      </w:r>
+      <w:commentRangeEnd w:id="1"/>
+      <w:r>
+        <w:rPr>
+          <w:rStyle w:val="CommentReference"/>
+          <w:rFonts w:asciiTheme="minorHAnsi" w:eastAsiaTheme="minorHAnsi" w:hAnsiTheme="minorHAnsi" w:cstheme="minorBidi"/>
+          <w:color w:val="auto"/>
+        </w:rPr>
+        <w:commentReference w:id="1"/>
+      </w:r>
+    </w:p>
+    <w:p/>
     <w:p>
       <w:pPr>
         <w:pStyle w:val="Heading2"/>
@@ -45,8 +97,8 @@
           <w:b/>
           <w:bCs/>
           <w:color w:val="000000" w:themeColor="text1"/>
-          <w:sz w:val="32"/>
-          <w:szCs w:val="32"/>
+          <w:sz w:val="28"/>
+          <w:szCs w:val="28"/>
         </w:rPr>
       </w:pPr>
       <w:r>
@@ -57,8 +109,115 @@
           <w:sz w:val="28"/>
           <w:szCs w:val="28"/>
         </w:rPr>
-        <w:t>Data</w:t>
-      </w:r>
+        <w:t>Summary</w:t>
+      </w:r>
+    </w:p>
+    <w:p>
+      <w:pPr>
+        <w:rPr>
+          <w:sz w:val="24"/>
+          <w:szCs w:val="24"/>
+        </w:rPr>
+      </w:pPr>
+    </w:p>
+    <w:p>
+      <w:pPr>
+        <w:ind w:left="360"/>
+        <w:rPr>
+          <w:sz w:val="24"/>
+          <w:szCs w:val="24"/>
+        </w:rPr>
+      </w:pPr>
+      <w:r>
+        <w:rPr>
+          <w:sz w:val="24"/>
+          <w:szCs w:val="24"/>
+        </w:rPr>
+        <w:t xml:space="preserve">Ticket Designer is a collaborative application that allows multiple users to </w:t>
+      </w:r>
+      <w:r>
+        <w:rPr>
+          <w:sz w:val="24"/>
+          <w:szCs w:val="24"/>
+        </w:rPr>
+        <w:t>create</w:t>
+      </w:r>
+      <w:r>
+        <w:rPr>
+          <w:sz w:val="24"/>
+          <w:szCs w:val="24"/>
+        </w:rPr>
+        <w:t>, edit, and delete custom ticket screens and buttons simultane</w:t>
+      </w:r>
+      <w:bookmarkStart w:id="2" w:name="_GoBack"/>
+      <w:bookmarkEnd w:id="2"/>
+      <w:r>
+        <w:rPr>
+          <w:sz w:val="24"/>
+          <w:szCs w:val="24"/>
+        </w:rPr>
+        <w:t xml:space="preserve">ously across multiple instances. This multi-user support enables real-time team collaboration on the same design </w:t>
+      </w:r>
+      <w:r>
+        <w:rPr>
+          <w:sz w:val="24"/>
+          <w:szCs w:val="24"/>
+        </w:rPr>
+        <w:t>components</w:t>
+      </w:r>
+      <w:r>
+        <w:rPr>
+          <w:sz w:val="24"/>
+          <w:szCs w:val="24"/>
+        </w:rPr>
+        <w:t xml:space="preserve"> without version conflicts, giving teams direct operational flexibility to modify their ticketing </w:t>
+      </w:r>
+      <w:r>
+        <w:rPr>
+          <w:sz w:val="24"/>
+          <w:szCs w:val="24"/>
+        </w:rPr>
+        <w:t>Interface</w:t>
+      </w:r>
+      <w:r>
+        <w:rPr>
+          <w:sz w:val="24"/>
+          <w:szCs w:val="24"/>
+        </w:rPr>
+        <w:t>s</w:t>
+      </w:r>
+      <w:r>
+        <w:rPr>
+          <w:sz w:val="24"/>
+          <w:szCs w:val="24"/>
+        </w:rPr>
+        <w:t>.</w:t>
+      </w:r>
+    </w:p>
+    <w:p>
+      <w:pPr>
+        <w:jc w:val="center"/>
+        <w:rPr>
+          <w:sz w:val="28"/>
+          <w:szCs w:val="28"/>
+        </w:rPr>
+      </w:pPr>
+    </w:p>
+    <w:p>
+      <w:pPr>
+        <w:pStyle w:val="Heading2"/>
+        <w:numPr>
+          <w:ilvl w:val="0"/>
+          <w:numId w:val="5"/>
+        </w:numPr>
+        <w:rPr>
+          <w:b/>
+          <w:bCs/>
+          <w:color w:val="000000" w:themeColor="text1"/>
+          <w:sz w:val="32"/>
+          <w:szCs w:val="32"/>
+        </w:rPr>
+      </w:pPr>
       <w:r>
         <w:rPr>
           <w:b/>
@@ -67,7 +226,7 @@
           <w:sz w:val="28"/>
           <w:szCs w:val="28"/>
         </w:rPr>
-        <w:t>b</w:t>
+        <w:t>Data</w:t>
       </w:r>
       <w:r>
         <w:rPr>
@@ -77,6 +236,16 @@
           <w:sz w:val="28"/>
           <w:szCs w:val="28"/>
         </w:rPr>
+        <w:t>b</w:t>
+      </w:r>
+      <w:r>
+        <w:rPr>
+          <w:b/>
+          <w:bCs/>
+          <w:color w:val="000000" w:themeColor="text1"/>
+          <w:sz w:val="28"/>
+          <w:szCs w:val="28"/>
+        </w:rPr>
         <w:t>ase configuration</w:t>
       </w:r>
     </w:p>
@@ -93,6 +262,7 @@
           <w:szCs w:val="24"/>
         </w:rPr>
       </w:pPr>
+      <w:commentRangeStart w:id="3"/>
       <w:r>
         <w:rPr>
           <w:sz w:val="24"/>
@@ -135,7 +305,36 @@
           <w:sz w:val="24"/>
           <w:szCs w:val="24"/>
         </w:rPr>
-        <w:t>” located in “</w:t>
+        <w:t>” located in</w:t>
+      </w:r>
+      <w:r>
+        <w:rPr>
+          <w:sz w:val="24"/>
+          <w:szCs w:val="24"/>
+        </w:rPr>
+        <w:t xml:space="preserve">side Application folder </w:t>
+      </w:r>
+      <w:r>
+        <w:rPr>
+          <w:sz w:val="24"/>
+          <w:szCs w:val="24"/>
+        </w:rPr>
+        <w:t>in</w:t>
+      </w:r>
+      <w:r>
+        <w:rPr>
+          <w:sz w:val="24"/>
+          <w:szCs w:val="24"/>
+        </w:rPr>
+        <w:t xml:space="preserve"> </w:t>
+      </w:r>
+      <w:commentRangeStart w:id="4"/>
+      <w:r>
+        <w:rPr>
+          <w:sz w:val="24"/>
+          <w:szCs w:val="24"/>
+        </w:rPr>
+        <w:t>“</w:t>
       </w:r>
       <w:r>
         <w:rPr>
@@ -158,14 +357,132 @@
           <w:sz w:val="24"/>
           <w:szCs w:val="24"/>
         </w:rPr>
-        <w:t>\Database</w:t>
-      </w:r>
-      <w:r>
-        <w:rPr>
-          <w:sz w:val="24"/>
-          <w:szCs w:val="24"/>
-        </w:rPr>
-        <w:t xml:space="preserve">”.  </w:t>
+        <w:t>\</w:t>
+      </w:r>
+      <w:commentRangeEnd w:id="4"/>
+      <w:r>
+        <w:rPr>
+          <w:rStyle w:val="CommentReference"/>
+        </w:rPr>
+        <w:commentReference w:id="4"/>
+      </w:r>
+      <w:r>
+        <w:rPr>
+          <w:sz w:val="24"/>
+          <w:szCs w:val="24"/>
+        </w:rPr>
+        <w:t>Database</w:t>
+      </w:r>
+      <w:r>
+        <w:rPr>
+          <w:sz w:val="24"/>
+          <w:szCs w:val="24"/>
+        </w:rPr>
+        <w:t>”</w:t>
+      </w:r>
+      <w:r>
+        <w:rPr>
+          <w:sz w:val="24"/>
+          <w:szCs w:val="24"/>
+        </w:rPr>
+        <w:t xml:space="preserve"> using SQL Server Management </w:t>
+      </w:r>
+      <w:r>
+        <w:rPr>
+          <w:sz w:val="24"/>
+          <w:szCs w:val="24"/>
+        </w:rPr>
+        <w:t>Studio</w:t>
+      </w:r>
+      <w:r>
+        <w:rPr>
+          <w:sz w:val="24"/>
+          <w:szCs w:val="24"/>
+        </w:rPr>
+        <w:t xml:space="preserve">, you must create a new query to execute the script on the </w:t>
+      </w:r>
+      <w:r>
+        <w:rPr>
+          <w:sz w:val="24"/>
+          <w:szCs w:val="24"/>
+        </w:rPr>
+        <w:t>Dedicated</w:t>
+      </w:r>
+      <w:r>
+        <w:rPr>
+          <w:sz w:val="24"/>
+          <w:szCs w:val="24"/>
+        </w:rPr>
+        <w:t xml:space="preserve"> server</w:t>
+      </w:r>
+      <w:r>
+        <w:rPr>
+          <w:sz w:val="24"/>
+          <w:szCs w:val="24"/>
+        </w:rPr>
+        <w:t>.</w:t>
+      </w:r>
+    </w:p>
+    <w:p>
+      <w:pPr>
+        <w:pStyle w:val="ListParagraph"/>
+        <w:numPr>
+          <w:ilvl w:val="0"/>
+          <w:numId w:val="6"/>
+        </w:numPr>
+        <w:rPr>
+          <w:sz w:val="24"/>
+          <w:szCs w:val="24"/>
+        </w:rPr>
+      </w:pPr>
+      <w:r>
+        <w:rPr>
+          <w:sz w:val="24"/>
+          <w:szCs w:val="24"/>
+        </w:rPr>
+        <w:t>Zero Errors must appear</w:t>
+      </w:r>
+      <w:r>
+        <w:rPr>
+          <w:sz w:val="24"/>
+          <w:szCs w:val="24"/>
+        </w:rPr>
+        <w:t>.</w:t>
+      </w:r>
+      <w:r>
+        <w:rPr>
+          <w:sz w:val="24"/>
+          <w:szCs w:val="24"/>
+        </w:rPr>
+        <w:t xml:space="preserve"> to confirm the Database creation was successful you can</w:t>
+      </w:r>
+      <w:r>
+        <w:rPr>
+          <w:sz w:val="24"/>
+          <w:szCs w:val="24"/>
+        </w:rPr>
+        <w:t xml:space="preserve"> also</w:t>
+      </w:r>
+      <w:r>
+        <w:rPr>
+          <w:sz w:val="24"/>
+          <w:szCs w:val="24"/>
+        </w:rPr>
+        <w:t xml:space="preserve"> see the database appearing inside the bank’s server databases and all created tables, triggers and index</w:t>
+      </w:r>
+      <w:commentRangeEnd w:id="3"/>
+      <w:r>
+        <w:rPr>
+          <w:sz w:val="24"/>
+          <w:szCs w:val="24"/>
+        </w:rPr>
+        <w:t>es will appear inside the newly created database.</w:t>
+      </w:r>
+      <w:r>
+        <w:rPr>
+          <w:rStyle w:val="CommentReference"/>
+        </w:rPr>
+        <w:commentReference w:id="3"/>
       </w:r>
     </w:p>
     <w:p>
@@ -266,7 +583,21 @@
           <w:sz w:val="24"/>
           <w:szCs w:val="24"/>
         </w:rPr>
-        <w:t>” located in “\</w:t>
+        <w:t>” located in</w:t>
+      </w:r>
+      <w:r>
+        <w:rPr>
+          <w:sz w:val="24"/>
+          <w:szCs w:val="24"/>
+        </w:rPr>
+        <w:t>side Application folder in “</w:t>
+      </w:r>
+      <w:r>
+        <w:rPr>
+          <w:sz w:val="24"/>
+          <w:szCs w:val="24"/>
+        </w:rPr>
+        <w:t>\</w:t>
       </w:r>
       <w:proofErr w:type="spellStart"/>
       <w:r>
@@ -282,14 +613,29 @@
           <w:sz w:val="24"/>
           <w:szCs w:val="24"/>
         </w:rPr>
-        <w:t>\Config</w:t>
-      </w:r>
-      <w:r>
-        <w:rPr>
-          <w:sz w:val="24"/>
-          <w:szCs w:val="24"/>
-        </w:rPr>
-        <w:t>” by filling what is in between “”</w:t>
+        <w:t>\bin\Release\Config</w:t>
+      </w:r>
+      <w:commentRangeStart w:id="5"/>
+      <w:r>
+        <w:rPr>
+          <w:sz w:val="24"/>
+          <w:szCs w:val="24"/>
+        </w:rPr>
+        <w:t>”</w:t>
+      </w:r>
+      <w:commentRangeEnd w:id="5"/>
+      <w:r>
+        <w:rPr>
+          <w:rStyle w:val="CommentReference"/>
+        </w:rPr>
+        <w:commentReference w:id="5"/>
+      </w:r>
+      <w:r>
+        <w:rPr>
+          <w:sz w:val="24"/>
+          <w:szCs w:val="24"/>
+        </w:rPr>
+        <w:t xml:space="preserve"> by filling what is in between “”</w:t>
       </w:r>
       <w:r>
         <w:rPr>
@@ -308,11 +654,12 @@
       </w:pPr>
       <w:r>
         <w:rPr>
+          <w:noProof/>
           <w:sz w:val="24"/>
           <w:szCs w:val="24"/>
         </w:rPr>
         <w:drawing>
-          <wp:anchor distT="0" distB="0" distL="114300" distR="114300" simplePos="0" relativeHeight="251658240" behindDoc="1" locked="0" layoutInCell="1" allowOverlap="1" wp14:anchorId="60B215CD">
+          <wp:anchor distT="0" distB="0" distL="114300" distR="114300" simplePos="0" relativeHeight="251658240" behindDoc="1" locked="0" layoutInCell="1" allowOverlap="1" wp14:anchorId="05E3DCE1" wp14:editId="119D55A5">
             <wp:simplePos x="0" y="0"/>
             <wp:positionH relativeFrom="column">
               <wp:posOffset>1648415</wp:posOffset>
@@ -343,7 +690,7 @@
                     <pic:cNvPicPr/>
                   </pic:nvPicPr>
                   <pic:blipFill>
-                    <a:blip r:embed="rId5">
+                    <a:blip r:embed="rId8">
                       <a:extLst>
                         <a:ext uri="{28A0092B-C50C-407E-A947-70E740481C1C}">
                           <a14:useLocalDpi xmlns:a14="http://schemas.microsoft.com/office/drawing/2010/main" val="0"/>
@@ -493,21 +840,14 @@
           <w:sz w:val="24"/>
           <w:szCs w:val="24"/>
         </w:rPr>
-        <w:t xml:space="preserve">If we choose </w:t>
-      </w:r>
-      <w:r>
-        <w:rPr>
-          <w:sz w:val="24"/>
-          <w:szCs w:val="24"/>
-        </w:rPr>
-        <w:t>“Windows Authentication”</w:t>
-      </w:r>
-      <w:r>
-        <w:rPr>
-          <w:sz w:val="24"/>
-          <w:szCs w:val="24"/>
-        </w:rPr>
-        <w:t xml:space="preserve"> we don’t have to fill any other Information in the config file</w:t>
+        <w:t xml:space="preserve">In both Scenarios </w:t>
+      </w:r>
+      <w:r>
+        <w:rPr>
+          <w:sz w:val="24"/>
+          <w:szCs w:val="24"/>
+        </w:rPr>
+        <w:t>we must fill “Server” with our server name or IP, “Database” with database name</w:t>
       </w:r>
     </w:p>
     <w:p>
@@ -543,6 +883,77 @@
           <w:sz w:val="24"/>
           <w:szCs w:val="24"/>
         </w:rPr>
+        <w:t>“Windows Authentication”</w:t>
+      </w:r>
+      <w:r>
+        <w:rPr>
+          <w:sz w:val="24"/>
+          <w:szCs w:val="24"/>
+        </w:rPr>
+        <w:t xml:space="preserve"> we don’t have to fill any other Information in the config file</w:t>
+      </w:r>
+      <w:r>
+        <w:rPr>
+          <w:sz w:val="24"/>
+          <w:szCs w:val="24"/>
+        </w:rPr>
+        <w:t xml:space="preserve">, since Windows Authentication mode </w:t>
+      </w:r>
+      <w:r>
+        <w:rPr>
+          <w:sz w:val="24"/>
+          <w:szCs w:val="24"/>
+        </w:rPr>
+        <w:t>relies</w:t>
+      </w:r>
+      <w:r>
+        <w:rPr>
+          <w:sz w:val="24"/>
+          <w:szCs w:val="24"/>
+        </w:rPr>
+        <w:t xml:space="preserve"> on Windows own credentials</w:t>
+      </w:r>
+      <w:r>
+        <w:rPr>
+          <w:sz w:val="24"/>
+          <w:szCs w:val="24"/>
+        </w:rPr>
+        <w:t>.</w:t>
+      </w:r>
+    </w:p>
+    <w:p>
+      <w:pPr>
+        <w:pStyle w:val="ListParagraph"/>
+        <w:rPr>
+          <w:sz w:val="24"/>
+          <w:szCs w:val="24"/>
+        </w:rPr>
+      </w:pPr>
+    </w:p>
+    <w:p>
+      <w:pPr>
+        <w:pStyle w:val="ListParagraph"/>
+        <w:numPr>
+          <w:ilvl w:val="0"/>
+          <w:numId w:val="7"/>
+        </w:numPr>
+        <w:rPr>
+          <w:sz w:val="24"/>
+          <w:szCs w:val="24"/>
+        </w:rPr>
+      </w:pPr>
+      <w:r>
+        <w:rPr>
+          <w:sz w:val="24"/>
+          <w:szCs w:val="24"/>
+        </w:rPr>
+        <w:t xml:space="preserve">If we choose </w:t>
+      </w:r>
+      <w:r>
+        <w:rPr>
+          <w:sz w:val="24"/>
+          <w:szCs w:val="24"/>
+        </w:rPr>
         <w:t>“Server Authentication”</w:t>
       </w:r>
       <w:r>
@@ -550,63 +961,51 @@
           <w:sz w:val="24"/>
           <w:szCs w:val="24"/>
         </w:rPr>
-        <w:t xml:space="preserve"> we must fill “S</w:t>
-      </w:r>
-      <w:r>
-        <w:rPr>
-          <w:sz w:val="24"/>
-          <w:szCs w:val="24"/>
-        </w:rPr>
-        <w:t>erver</w:t>
-      </w:r>
-      <w:r>
-        <w:rPr>
-          <w:sz w:val="24"/>
-          <w:szCs w:val="24"/>
-        </w:rPr>
-        <w:t>” with our server name</w:t>
-      </w:r>
-      <w:r>
-        <w:rPr>
-          <w:sz w:val="24"/>
-          <w:szCs w:val="24"/>
-        </w:rPr>
-        <w:t xml:space="preserve">, </w:t>
-      </w:r>
-      <w:r>
-        <w:rPr>
-          <w:sz w:val="24"/>
-          <w:szCs w:val="24"/>
-        </w:rPr>
-        <w:t>“D</w:t>
-      </w:r>
-      <w:r>
-        <w:rPr>
-          <w:sz w:val="24"/>
-          <w:szCs w:val="24"/>
-        </w:rPr>
-        <w:t>ata</w:t>
-      </w:r>
-      <w:r>
-        <w:rPr>
-          <w:sz w:val="24"/>
-          <w:szCs w:val="24"/>
-        </w:rPr>
-        <w:t>b</w:t>
-      </w:r>
-      <w:r>
-        <w:rPr>
-          <w:sz w:val="24"/>
-          <w:szCs w:val="24"/>
-        </w:rPr>
-        <w:t>ase</w:t>
-      </w:r>
-      <w:r>
-        <w:rPr>
-          <w:sz w:val="24"/>
-          <w:szCs w:val="24"/>
-        </w:rPr>
-        <w:t>” with database name</w:t>
+        <w:t xml:space="preserve">, we must fill </w:t>
+      </w:r>
+      <w:r>
+        <w:rPr>
+          <w:sz w:val="24"/>
+          <w:szCs w:val="24"/>
+        </w:rPr>
+        <w:t>“</w:t>
+      </w:r>
+      <w:proofErr w:type="spellStart"/>
+      <w:r>
+        <w:rPr>
+          <w:sz w:val="24"/>
+          <w:szCs w:val="24"/>
+        </w:rPr>
+        <w:t>TrustServerCertificate</w:t>
+      </w:r>
+      <w:proofErr w:type="spellEnd"/>
+      <w:r>
+        <w:rPr>
+          <w:sz w:val="24"/>
+          <w:szCs w:val="24"/>
+        </w:rPr>
+        <w:t>” with either “True”</w:t>
+      </w:r>
+      <w:r>
+        <w:rPr>
+          <w:sz w:val="24"/>
+          <w:szCs w:val="24"/>
+        </w:rPr>
+        <w:t xml:space="preserve"> or “</w:t>
+      </w:r>
+      <w:r>
+        <w:rPr>
+          <w:sz w:val="24"/>
+          <w:szCs w:val="24"/>
+        </w:rPr>
+        <w:t>true</w:t>
+      </w:r>
+      <w:r>
+        <w:rPr>
+          <w:sz w:val="24"/>
+          <w:szCs w:val="24"/>
+        </w:rPr>
+        <w:t>”</w:t>
       </w:r>
       <w:r>
         <w:rPr>
@@ -620,6 +1019,20 @@
           <w:sz w:val="24"/>
           <w:szCs w:val="24"/>
         </w:rPr>
+        <w:t xml:space="preserve"> when we trust our server or use self-signed certificates</w:t>
+      </w:r>
+      <w:r>
+        <w:rPr>
+          <w:sz w:val="24"/>
+          <w:szCs w:val="24"/>
+        </w:rPr>
+        <w:t>,</w:t>
+      </w:r>
+      <w:r>
+        <w:rPr>
+          <w:sz w:val="24"/>
+          <w:szCs w:val="24"/>
+        </w:rPr>
         <w:t xml:space="preserve"> </w:t>
       </w:r>
       <w:r>
@@ -629,13 +1042,121 @@
         </w:rPr>
         <w:t>“</w:t>
       </w:r>
+      <w:commentRangeStart w:id="6"/>
+      <w:r>
+        <w:rPr>
+          <w:sz w:val="24"/>
+          <w:szCs w:val="24"/>
+        </w:rPr>
+        <w:t>False</w:t>
+      </w:r>
+      <w:commentRangeEnd w:id="6"/>
+      <w:r>
+        <w:rPr>
+          <w:rStyle w:val="CommentReference"/>
+        </w:rPr>
+        <w:commentReference w:id="6"/>
+      </w:r>
+      <w:r>
+        <w:rPr>
+          <w:sz w:val="24"/>
+          <w:szCs w:val="24"/>
+        </w:rPr>
+        <w:t>”</w:t>
+      </w:r>
+      <w:r>
+        <w:rPr>
+          <w:sz w:val="24"/>
+          <w:szCs w:val="24"/>
+        </w:rPr>
+        <w:t xml:space="preserve"> </w:t>
+      </w:r>
+      <w:proofErr w:type="gramStart"/>
+      <w:r>
+        <w:rPr>
+          <w:sz w:val="24"/>
+          <w:szCs w:val="24"/>
+        </w:rPr>
+        <w:t xml:space="preserve">or </w:t>
+      </w:r>
+      <w:r>
+        <w:rPr>
+          <w:sz w:val="24"/>
+          <w:szCs w:val="24"/>
+        </w:rPr>
+        <w:t>”false</w:t>
+      </w:r>
+      <w:proofErr w:type="gramEnd"/>
+      <w:r>
+        <w:rPr>
+          <w:sz w:val="24"/>
+          <w:szCs w:val="24"/>
+        </w:rPr>
+        <w:t>”</w:t>
+      </w:r>
+      <w:r>
+        <w:rPr>
+          <w:sz w:val="24"/>
+          <w:szCs w:val="24"/>
+        </w:rPr>
+        <w:t>,</w:t>
+      </w:r>
+      <w:r>
+        <w:rPr>
+          <w:sz w:val="24"/>
+          <w:szCs w:val="24"/>
+        </w:rPr>
+        <w:t xml:space="preserve"> when</w:t>
+      </w:r>
+      <w:r>
+        <w:rPr>
+          <w:sz w:val="24"/>
+          <w:szCs w:val="24"/>
+        </w:rPr>
+        <w:t xml:space="preserve"> we</w:t>
+      </w:r>
+      <w:r>
+        <w:rPr>
+          <w:sz w:val="24"/>
+          <w:szCs w:val="24"/>
+        </w:rPr>
+        <w:t xml:space="preserve"> force strict check</w:t>
+      </w:r>
+      <w:r>
+        <w:rPr>
+          <w:sz w:val="24"/>
+          <w:szCs w:val="24"/>
+        </w:rPr>
+        <w:t>s</w:t>
+      </w:r>
+      <w:r>
+        <w:rPr>
+          <w:sz w:val="24"/>
+          <w:szCs w:val="24"/>
+        </w:rPr>
+        <w:t xml:space="preserve"> for certificates,</w:t>
+      </w:r>
+      <w:r>
+        <w:rPr>
+          <w:sz w:val="24"/>
+          <w:szCs w:val="24"/>
+        </w:rPr>
+        <w:t xml:space="preserve"> </w:t>
+      </w:r>
+      <w:r>
+        <w:rPr>
+          <w:sz w:val="24"/>
+          <w:szCs w:val="24"/>
+        </w:rPr>
+        <w:t>also fill “</w:t>
+      </w:r>
       <w:proofErr w:type="spellStart"/>
       <w:r>
         <w:rPr>
           <w:sz w:val="24"/>
           <w:szCs w:val="24"/>
         </w:rPr>
-        <w:t>TrustServerCertificate</w:t>
+        <w:t>UserId</w:t>
       </w:r>
       <w:proofErr w:type="spellEnd"/>
       <w:r>
@@ -643,15 +1164,7 @@
           <w:sz w:val="24"/>
           <w:szCs w:val="24"/>
         </w:rPr>
-        <w:t xml:space="preserve">” with either “True” when we </w:t>
-      </w:r>
-      <w:r>
-        <w:rPr>
-          <w:sz w:val="24"/>
-          <w:szCs w:val="24"/>
-        </w:rPr>
-        <w:lastRenderedPageBreak/>
-        <w:t>trust our server or use self-signed certificates or “False” when force strict check for certificates,</w:t>
+        <w:t>” with your user ID in server and</w:t>
       </w:r>
       <w:r>
         <w:rPr>
@@ -665,60 +1178,7 @@
           <w:sz w:val="24"/>
           <w:szCs w:val="24"/>
         </w:rPr>
-        <w:t>also fill “</w:t>
-      </w:r>
-      <w:proofErr w:type="spellStart"/>
-      <w:r>
-        <w:rPr>
-          <w:sz w:val="24"/>
-          <w:szCs w:val="24"/>
-        </w:rPr>
-        <w:t>UserId</w:t>
-      </w:r>
-      <w:proofErr w:type="spellEnd"/>
-      <w:r>
-        <w:rPr>
-          <w:sz w:val="24"/>
-          <w:szCs w:val="24"/>
-        </w:rPr>
-        <w:t xml:space="preserve">” with your user ID in server </w:t>
-      </w:r>
-      <w:proofErr w:type="gramStart"/>
-      <w:r>
-        <w:rPr>
-          <w:sz w:val="24"/>
-          <w:szCs w:val="24"/>
-        </w:rPr>
-        <w:t>and</w:t>
-      </w:r>
-      <w:r>
-        <w:rPr>
-          <w:sz w:val="24"/>
-          <w:szCs w:val="24"/>
-        </w:rPr>
-        <w:t xml:space="preserve"> </w:t>
-      </w:r>
-      <w:r>
-        <w:rPr>
-          <w:sz w:val="24"/>
-          <w:szCs w:val="24"/>
-        </w:rPr>
-        <w:t>”P</w:t>
-      </w:r>
-      <w:r>
-        <w:rPr>
-          <w:sz w:val="24"/>
-          <w:szCs w:val="24"/>
-        </w:rPr>
-        <w:t>assword</w:t>
-      </w:r>
-      <w:proofErr w:type="gramEnd"/>
-      <w:r>
-        <w:rPr>
-          <w:sz w:val="24"/>
-          <w:szCs w:val="24"/>
-        </w:rPr>
-        <w:t>”.</w:t>
+        <w:t>”Password”.</w:t>
       </w:r>
     </w:p>
     <w:p>
@@ -745,6 +1205,7 @@
           <w:szCs w:val="28"/>
         </w:rPr>
       </w:pPr>
+      <w:commentRangeStart w:id="7"/>
       <w:r>
         <w:rPr>
           <w:b/>
@@ -765,6 +1226,15 @@
         </w:rPr>
         <w:t xml:space="preserve"> (Login and Register)</w:t>
       </w:r>
+      <w:commentRangeEnd w:id="7"/>
+      <w:r>
+        <w:rPr>
+          <w:rStyle w:val="CommentReference"/>
+          <w:rFonts w:asciiTheme="minorHAnsi" w:eastAsiaTheme="minorHAnsi" w:hAnsiTheme="minorHAnsi" w:cstheme="minorBidi"/>
+          <w:color w:val="auto"/>
+        </w:rPr>
+        <w:commentReference w:id="7"/>
+      </w:r>
     </w:p>
     <w:p/>
     <w:p>
@@ -784,38 +1254,21 @@
           <w:sz w:val="24"/>
           <w:szCs w:val="24"/>
         </w:rPr>
-        <w:t>Login</w:t>
-      </w:r>
-      <w:r>
-        <w:t xml:space="preserve"> </w:t>
-      </w:r>
-      <w:r>
-        <w:rPr>
-          <w:sz w:val="24"/>
-          <w:szCs w:val="24"/>
-        </w:rPr>
-        <w:t xml:space="preserve">with your bank ID, if </w:t>
-      </w:r>
-      <w:r>
-        <w:rPr>
-          <w:sz w:val="24"/>
-          <w:szCs w:val="24"/>
-        </w:rPr>
-        <w:t xml:space="preserve">the </w:t>
-      </w:r>
-      <w:r>
-        <w:rPr>
-          <w:sz w:val="24"/>
-          <w:szCs w:val="24"/>
-        </w:rPr>
-        <w:t>bank is not registered yet, Click register and fill the text box with the bank name</w:t>
-      </w:r>
-      <w:r>
-        <w:rPr>
-          <w:sz w:val="24"/>
-          <w:szCs w:val="24"/>
-        </w:rPr>
-        <w:t>.</w:t>
+        <w:t>Open “</w:t>
+      </w:r>
+      <w:r>
+        <w:rPr>
+          <w:sz w:val="24"/>
+          <w:szCs w:val="24"/>
+        </w:rPr>
+        <w:t>App.WinForms.exe</w:t>
+      </w:r>
+      <w:r>
+        <w:rPr>
+          <w:sz w:val="24"/>
+          <w:szCs w:val="24"/>
+        </w:rPr>
+        <w:t>” to launch the Application</w:t>
       </w:r>
     </w:p>
     <w:p>
@@ -844,6 +1297,67 @@
           <w:sz w:val="24"/>
           <w:szCs w:val="24"/>
         </w:rPr>
+        <w:t>Login</w:t>
+      </w:r>
+      <w:r>
+        <w:t xml:space="preserve"> </w:t>
+      </w:r>
+      <w:r>
+        <w:rPr>
+          <w:sz w:val="24"/>
+          <w:szCs w:val="24"/>
+        </w:rPr>
+        <w:t xml:space="preserve">with your bank ID, if </w:t>
+      </w:r>
+      <w:r>
+        <w:rPr>
+          <w:sz w:val="24"/>
+          <w:szCs w:val="24"/>
+        </w:rPr>
+        <w:t xml:space="preserve">the </w:t>
+      </w:r>
+      <w:r>
+        <w:rPr>
+          <w:sz w:val="24"/>
+          <w:szCs w:val="24"/>
+        </w:rPr>
+        <w:t>bank is not registered yet, Click register and fill the text box with the bank name</w:t>
+      </w:r>
+      <w:r>
+        <w:rPr>
+          <w:sz w:val="24"/>
+          <w:szCs w:val="24"/>
+        </w:rPr>
+        <w:t>.</w:t>
+      </w:r>
+    </w:p>
+    <w:p>
+      <w:pPr>
+        <w:pStyle w:val="ListParagraph"/>
+        <w:rPr>
+          <w:sz w:val="24"/>
+          <w:szCs w:val="24"/>
+        </w:rPr>
+      </w:pPr>
+    </w:p>
+    <w:p>
+      <w:pPr>
+        <w:pStyle w:val="ListParagraph"/>
+        <w:numPr>
+          <w:ilvl w:val="0"/>
+          <w:numId w:val="7"/>
+        </w:numPr>
+        <w:rPr>
+          <w:sz w:val="24"/>
+          <w:szCs w:val="24"/>
+        </w:rPr>
+      </w:pPr>
+      <w:commentRangeStart w:id="8"/>
+      <w:r>
+        <w:rPr>
+          <w:sz w:val="24"/>
+          <w:szCs w:val="24"/>
+        </w:rPr>
         <w:t>A pop-up with show your bank’s ID to use it for future logins.</w:t>
       </w:r>
       <w:r>
@@ -852,22 +1366,30 @@
         </w:rPr>
         <w:t xml:space="preserve"> </w:t>
       </w:r>
-    </w:p>
-    <w:p>
-      <w:pPr>
-        <w:pStyle w:val="ListParagraph"/>
-        <w:rPr>
-          <w:sz w:val="24"/>
-          <w:szCs w:val="24"/>
-        </w:rPr>
-      </w:pPr>
-      <w:r>
-        <w:rPr>
+      <w:commentRangeEnd w:id="8"/>
+      <w:r>
+        <w:rPr>
+          <w:rStyle w:val="CommentReference"/>
+        </w:rPr>
+        <w:commentReference w:id="8"/>
+      </w:r>
+    </w:p>
+    <w:p>
+      <w:pPr>
+        <w:pStyle w:val="ListParagraph"/>
+        <w:rPr>
+          <w:sz w:val="24"/>
+          <w:szCs w:val="24"/>
+        </w:rPr>
+      </w:pPr>
+      <w:r>
+        <w:rPr>
+          <w:noProof/>
           <w:sz w:val="24"/>
           <w:szCs w:val="24"/>
         </w:rPr>
         <w:drawing>
-          <wp:anchor distT="0" distB="0" distL="114300" distR="114300" simplePos="0" relativeHeight="251660288" behindDoc="1" locked="0" layoutInCell="1" allowOverlap="1" wp14:anchorId="2C5B2690">
+          <wp:anchor distT="0" distB="0" distL="114300" distR="114300" simplePos="0" relativeHeight="251660288" behindDoc="1" locked="0" layoutInCell="1" allowOverlap="1" wp14:anchorId="5BEB4D5E" wp14:editId="6D03F25A">
             <wp:simplePos x="0" y="0"/>
             <wp:positionH relativeFrom="column">
               <wp:posOffset>337820</wp:posOffset>
@@ -898,7 +1420,7 @@
                     <pic:cNvPicPr/>
                   </pic:nvPicPr>
                   <pic:blipFill>
-                    <a:blip r:embed="rId6">
+                    <a:blip r:embed="rId9">
                       <a:extLst>
                         <a:ext uri="{28A0092B-C50C-407E-A947-70E740481C1C}">
                           <a14:useLocalDpi xmlns:a14="http://schemas.microsoft.com/office/drawing/2010/main" val="0"/>
@@ -932,11 +1454,12 @@
       </w:r>
       <w:r>
         <w:rPr>
+          <w:noProof/>
           <w:sz w:val="24"/>
           <w:szCs w:val="24"/>
         </w:rPr>
         <w:drawing>
-          <wp:anchor distT="0" distB="0" distL="114300" distR="114300" simplePos="0" relativeHeight="251659264" behindDoc="1" locked="0" layoutInCell="1" allowOverlap="1" wp14:anchorId="27946954">
+          <wp:anchor distT="0" distB="0" distL="114300" distR="114300" simplePos="0" relativeHeight="251659264" behindDoc="1" locked="0" layoutInCell="1" allowOverlap="1" wp14:anchorId="4B75536A" wp14:editId="6F0DF8EC">
             <wp:simplePos x="0" y="0"/>
             <wp:positionH relativeFrom="column">
               <wp:posOffset>3576945</wp:posOffset>
@@ -967,7 +1490,7 @@
                     <pic:cNvPicPr/>
                   </pic:nvPicPr>
                   <pic:blipFill>
-                    <a:blip r:embed="rId7">
+                    <a:blip r:embed="rId10">
                       <a:extLst>
                         <a:ext uri="{28A0092B-C50C-407E-A947-70E740481C1C}">
                           <a14:useLocalDpi xmlns:a14="http://schemas.microsoft.com/office/drawing/2010/main" val="0"/>
@@ -1033,9 +1556,10 @@
           <w:sz w:val="28"/>
           <w:szCs w:val="28"/>
         </w:rPr>
+        <w:lastRenderedPageBreak/>
         <w:t xml:space="preserve">Screen </w:t>
       </w:r>
-      <w:bookmarkStart w:id="0" w:name="_Hlk236296835"/>
+      <w:bookmarkStart w:id="9" w:name="_Hlk236296835"/>
       <w:r>
         <w:rPr>
           <w:b/>
@@ -1056,7 +1580,7 @@
         </w:rPr>
         <w:t xml:space="preserve"> </w:t>
       </w:r>
-      <w:bookmarkEnd w:id="0"/>
+      <w:bookmarkEnd w:id="9"/>
       <w:r>
         <w:rPr>
           <w:b/>
@@ -1212,44 +1736,20 @@
           <w:szCs w:val="24"/>
         </w:rPr>
       </w:pPr>
-    </w:p>
-    <w:p>
-      <w:pPr>
-        <w:rPr>
-          <w:sz w:val="24"/>
-          <w:szCs w:val="24"/>
-        </w:rPr>
-      </w:pPr>
-    </w:p>
-    <w:p>
-      <w:pPr>
-        <w:rPr>
-          <w:sz w:val="24"/>
-          <w:szCs w:val="24"/>
-        </w:rPr>
-      </w:pPr>
-    </w:p>
-    <w:p>
-      <w:pPr>
-        <w:rPr>
-          <w:sz w:val="24"/>
-          <w:szCs w:val="24"/>
-        </w:rPr>
-      </w:pPr>
-      <w:r>
-        <w:rPr>
-          <w:sz w:val="24"/>
-          <w:szCs w:val="24"/>
-        </w:rPr>
-        <w:lastRenderedPageBreak/>
+      <w:r>
+        <w:rPr>
+          <w:noProof/>
+          <w:sz w:val="24"/>
+          <w:szCs w:val="24"/>
+        </w:rPr>
         <w:drawing>
-          <wp:anchor distT="0" distB="0" distL="114300" distR="114300" simplePos="0" relativeHeight="251661312" behindDoc="1" locked="0" layoutInCell="1" allowOverlap="1" wp14:anchorId="7AE4CA84">
+          <wp:anchor distT="0" distB="0" distL="114300" distR="114300" simplePos="0" relativeHeight="251661312" behindDoc="1" locked="0" layoutInCell="1" allowOverlap="1" wp14:anchorId="061379C3" wp14:editId="02A1354F">
             <wp:simplePos x="0" y="0"/>
             <wp:positionH relativeFrom="margin">
-              <wp:align>center</wp:align>
+              <wp:posOffset>958215</wp:posOffset>
             </wp:positionH>
             <wp:positionV relativeFrom="paragraph">
-              <wp:posOffset>155</wp:posOffset>
+              <wp:posOffset>125730</wp:posOffset>
             </wp:positionV>
             <wp:extent cx="4485005" cy="3451860"/>
             <wp:effectExtent l="0" t="0" r="0" b="0"/>
@@ -1274,7 +1774,7 @@
                     <pic:cNvPicPr/>
                   </pic:nvPicPr>
                   <pic:blipFill>
-                    <a:blip r:embed="rId8">
+                    <a:blip r:embed="rId11">
                       <a:extLst>
                         <a:ext uri="{28A0092B-C50C-407E-A947-70E740481C1C}">
                           <a14:useLocalDpi xmlns:a14="http://schemas.microsoft.com/office/drawing/2010/main" val="0"/>
@@ -1306,6 +1806,30 @@
           </wp:anchor>
         </w:drawing>
       </w:r>
+    </w:p>
+    <w:p>
+      <w:pPr>
+        <w:rPr>
+          <w:sz w:val="24"/>
+          <w:szCs w:val="24"/>
+        </w:rPr>
+      </w:pPr>
+    </w:p>
+    <w:p>
+      <w:pPr>
+        <w:rPr>
+          <w:sz w:val="24"/>
+          <w:szCs w:val="24"/>
+        </w:rPr>
+      </w:pPr>
+    </w:p>
+    <w:p>
+      <w:pPr>
+        <w:rPr>
+          <w:sz w:val="24"/>
+          <w:szCs w:val="24"/>
+        </w:rPr>
+      </w:pPr>
       <w:r>
         <w:rPr>
           <w:sz w:val="24"/>
@@ -1425,7 +1949,7 @@
           <w:sz w:val="28"/>
           <w:szCs w:val="28"/>
         </w:rPr>
-        <w:t>Add/Edit Screen</w:t>
+        <w:t xml:space="preserve">Add/Edit Screen Form </w:t>
       </w:r>
       <w:r>
         <w:rPr>
@@ -1435,9 +1959,8 @@
           <w:sz w:val="28"/>
           <w:szCs w:val="28"/>
         </w:rPr>
-        <w:t xml:space="preserve"> Form </w:t>
-      </w:r>
-      <w:proofErr w:type="gramStart"/>
+        <w:t>and</w:t>
+      </w:r>
       <w:r>
         <w:rPr>
           <w:b/>
@@ -1446,17 +1969,6 @@
           <w:sz w:val="28"/>
           <w:szCs w:val="28"/>
         </w:rPr>
-        <w:t>And</w:t>
-      </w:r>
-      <w:proofErr w:type="gramEnd"/>
-      <w:r>
-        <w:rPr>
-          <w:b/>
-          <w:bCs/>
-          <w:color w:val="000000" w:themeColor="text1"/>
-          <w:sz w:val="28"/>
-          <w:szCs w:val="28"/>
-        </w:rPr>
         <w:t xml:space="preserve"> Add/Edit Button Form</w:t>
       </w:r>
     </w:p>
@@ -1485,23 +1997,21 @@
           <w:sz w:val="24"/>
           <w:szCs w:val="24"/>
         </w:rPr>
-        <w:t xml:space="preserve">In order to create a new screen </w:t>
-      </w:r>
-      <w:proofErr w:type="gramStart"/>
-      <w:r>
-        <w:rPr>
-          <w:sz w:val="24"/>
-          <w:szCs w:val="24"/>
-        </w:rPr>
-        <w:t>press</w:t>
-      </w:r>
-      <w:proofErr w:type="gramEnd"/>
-      <w:r>
-        <w:rPr>
-          <w:sz w:val="24"/>
-          <w:szCs w:val="24"/>
-        </w:rPr>
-        <w:t xml:space="preserve"> Add Screen</w:t>
+        <w:t>In order to create a new screen</w:t>
+      </w:r>
+      <w:r>
+        <w:rPr>
+          <w:sz w:val="24"/>
+          <w:szCs w:val="24"/>
+        </w:rPr>
+        <w:t>,</w:t>
+      </w:r>
+      <w:r>
+        <w:rPr>
+          <w:sz w:val="24"/>
+          <w:szCs w:val="24"/>
+        </w:rPr>
+        <w:t xml:space="preserve"> press Add Screen</w:t>
       </w:r>
       <w:r>
         <w:rPr>
@@ -1558,9 +2068,8 @@
           <w:sz w:val="24"/>
           <w:szCs w:val="24"/>
         </w:rPr>
-        <w:t xml:space="preserve">Add A button by pressing Add Button and fill all boxes, </w:t>
-      </w:r>
-      <w:proofErr w:type="gramStart"/>
+        <w:t xml:space="preserve">Add A button by pressing Add Button and fill all boxes </w:t>
+      </w:r>
       <w:r>
         <w:rPr>
           <w:sz w:val="24"/>
@@ -1568,7 +2077,6 @@
         </w:rPr>
         <w:t>If</w:t>
       </w:r>
-      <w:proofErr w:type="gramEnd"/>
       <w:r>
         <w:rPr>
           <w:sz w:val="24"/>
@@ -1579,14 +2087,35 @@
     </w:p>
     <w:p>
       <w:pPr>
-        <w:rPr>
-          <w:sz w:val="24"/>
-          <w:szCs w:val="24"/>
-        </w:rPr>
-      </w:pPr>
-      <w:r>
+        <w:pStyle w:val="ListParagraph"/>
+        <w:rPr>
+          <w:sz w:val="24"/>
+          <w:szCs w:val="24"/>
+        </w:rPr>
+      </w:pPr>
+    </w:p>
+    <w:p>
+      <w:pPr>
+        <w:pStyle w:val="ListParagraph"/>
+        <w:rPr>
+          <w:sz w:val="24"/>
+          <w:szCs w:val="24"/>
+        </w:rPr>
+      </w:pPr>
+    </w:p>
+    <w:p>
+      <w:pPr>
+        <w:rPr>
+          <w:sz w:val="24"/>
+          <w:szCs w:val="24"/>
+        </w:rPr>
+      </w:pPr>
+      <w:r>
+        <w:rPr>
+          <w:noProof/>
+        </w:rPr>
         <w:drawing>
-          <wp:anchor distT="0" distB="0" distL="114300" distR="114300" simplePos="0" relativeHeight="251662336" behindDoc="1" locked="0" layoutInCell="1" allowOverlap="1" wp14:anchorId="424B0465">
+          <wp:anchor distT="0" distB="0" distL="114300" distR="114300" simplePos="0" relativeHeight="251662336" behindDoc="1" locked="0" layoutInCell="1" allowOverlap="1" wp14:anchorId="1F4B2E7B" wp14:editId="2242D76A">
             <wp:simplePos x="0" y="0"/>
             <wp:positionH relativeFrom="margin">
               <wp:align>left</wp:align>
@@ -1617,7 +2146,7 @@
                     <pic:cNvPicPr/>
                   </pic:nvPicPr>
                   <pic:blipFill>
-                    <a:blip r:embed="rId9" cstate="print">
+                    <a:blip r:embed="rId12" cstate="print">
                       <a:extLst>
                         <a:ext uri="{28A0092B-C50C-407E-A947-70E740481C1C}">
                           <a14:useLocalDpi xmlns:a14="http://schemas.microsoft.com/office/drawing/2010/main" val="0"/>
@@ -1659,11 +2188,12 @@
       </w:pPr>
       <w:r>
         <w:rPr>
+          <w:noProof/>
           <w:sz w:val="24"/>
           <w:szCs w:val="24"/>
         </w:rPr>
         <w:drawing>
-          <wp:anchor distT="0" distB="0" distL="114300" distR="114300" simplePos="0" relativeHeight="251663360" behindDoc="1" locked="0" layoutInCell="1" allowOverlap="1" wp14:anchorId="66C49847">
+          <wp:anchor distT="0" distB="0" distL="114300" distR="114300" simplePos="0" relativeHeight="251663360" behindDoc="1" locked="0" layoutInCell="1" allowOverlap="1" wp14:anchorId="794EAFDB" wp14:editId="5ABD6728">
             <wp:simplePos x="0" y="0"/>
             <wp:positionH relativeFrom="margin">
               <wp:posOffset>3688150</wp:posOffset>
@@ -1694,7 +2224,7 @@
                     <pic:cNvPicPr/>
                   </pic:nvPicPr>
                   <pic:blipFill>
-                    <a:blip r:embed="rId10" cstate="print">
+                    <a:blip r:embed="rId13" cstate="print">
                       <a:extLst>
                         <a:ext uri="{28A0092B-C50C-407E-A947-70E740481C1C}">
                           <a14:useLocalDpi xmlns:a14="http://schemas.microsoft.com/office/drawing/2010/main" val="0"/>
@@ -1738,6 +2268,15 @@
     <w:p>
       <w:pPr>
         <w:pStyle w:val="ListParagraph"/>
+        <w:rPr>
+          <w:sz w:val="24"/>
+          <w:szCs w:val="24"/>
+        </w:rPr>
+      </w:pPr>
+    </w:p>
+    <w:p>
+      <w:pPr>
+        <w:pStyle w:val="ListParagraph"/>
         <w:numPr>
           <w:ilvl w:val="0"/>
           <w:numId w:val="7"/>
@@ -1752,26 +2291,36 @@
           <w:sz w:val="24"/>
           <w:szCs w:val="24"/>
         </w:rPr>
-        <w:lastRenderedPageBreak/>
-        <w:t xml:space="preserve">If we wanted to cancel creating a button after saving it you can simply delete it or you can edit a created button but still pending or edit </w:t>
-      </w:r>
-      <w:proofErr w:type="spellStart"/>
-      <w:proofErr w:type="gramStart"/>
-      <w:r>
-        <w:rPr>
-          <w:sz w:val="24"/>
-          <w:szCs w:val="24"/>
-        </w:rPr>
-        <w:t>a</w:t>
-      </w:r>
-      <w:proofErr w:type="spellEnd"/>
-      <w:proofErr w:type="gramEnd"/>
-      <w:r>
-        <w:rPr>
-          <w:sz w:val="24"/>
-          <w:szCs w:val="24"/>
-        </w:rPr>
-        <w:t xml:space="preserve"> already created and saved button as much as you want before saving</w:t>
+        <w:t>If we wanted to cancel creating a button after saving it you can simply delete it or you can edit a created button but still pending or edit a</w:t>
+      </w:r>
+      <w:r>
+        <w:rPr>
+          <w:sz w:val="24"/>
+          <w:szCs w:val="24"/>
+        </w:rPr>
+        <w:t>n</w:t>
+      </w:r>
+      <w:r>
+        <w:rPr>
+          <w:sz w:val="24"/>
+          <w:szCs w:val="24"/>
+        </w:rPr>
+        <w:t xml:space="preserve"> already created and saved button as much as you want </w:t>
+      </w:r>
+      <w:commentRangeStart w:id="10"/>
+      <w:r>
+        <w:rPr>
+          <w:sz w:val="24"/>
+          <w:szCs w:val="24"/>
+        </w:rPr>
+        <w:t>before saving</w:t>
+      </w:r>
+      <w:r>
+        <w:rPr>
+          <w:sz w:val="24"/>
+          <w:szCs w:val="24"/>
+        </w:rPr>
+        <w:t xml:space="preserve"> Screen</w:t>
       </w:r>
       <w:r>
         <w:rPr>
@@ -1779,6 +2328,13 @@
           <w:szCs w:val="24"/>
         </w:rPr>
         <w:t>.</w:t>
+      </w:r>
+      <w:commentRangeEnd w:id="10"/>
+      <w:r>
+        <w:rPr>
+          <w:rStyle w:val="CommentReference"/>
+        </w:rPr>
+        <w:commentReference w:id="10"/>
       </w:r>
     </w:p>
     <w:p>
@@ -1865,17 +2421,60 @@
           <w:sz w:val="24"/>
           <w:szCs w:val="24"/>
         </w:rPr>
-        <w:t>If Another user updated the same screen you will be out of sync if you try to save you can either refresh by pressing the button or press save will show you that your out of sync u can either Press Ok to sync or cancel to leave your editing screen and discard what you have done by far.</w:t>
-      </w:r>
-    </w:p>
-    <w:p>
-      <w:pPr>
-        <w:pStyle w:val="ListParagraph"/>
-        <w:rPr>
-          <w:sz w:val="24"/>
-          <w:szCs w:val="24"/>
-        </w:rPr>
-      </w:pPr>
+        <w:t>If another user updates this screen, saving will trigger an "out of sync" warning. You can either refresh now</w:t>
+      </w:r>
+      <w:r>
+        <w:rPr>
+          <w:sz w:val="24"/>
+          <w:szCs w:val="24"/>
+        </w:rPr>
+        <w:t xml:space="preserve"> by</w:t>
+      </w:r>
+      <w:r>
+        <w:rPr>
+          <w:sz w:val="24"/>
+          <w:szCs w:val="24"/>
+        </w:rPr>
+        <w:t xml:space="preserve"> click</w:t>
+      </w:r>
+      <w:r>
+        <w:rPr>
+          <w:sz w:val="24"/>
+          <w:szCs w:val="24"/>
+        </w:rPr>
+        <w:t>ing</w:t>
+      </w:r>
+      <w:r>
+        <w:rPr>
+          <w:sz w:val="24"/>
+          <w:szCs w:val="24"/>
+        </w:rPr>
+        <w:t xml:space="preserve"> OK on the warning to sync and save, or click Cancel to exit and discard your changes</w:t>
+      </w:r>
+      <w:commentRangeStart w:id="11"/>
+      <w:r>
+        <w:rPr>
+          <w:sz w:val="24"/>
+          <w:szCs w:val="24"/>
+        </w:rPr>
+        <w:t>.</w:t>
+      </w:r>
+    </w:p>
+    <w:commentRangeEnd w:id="11"/>
+    <w:p>
+      <w:pPr>
+        <w:pStyle w:val="ListParagraph"/>
+        <w:rPr>
+          <w:sz w:val="24"/>
+          <w:szCs w:val="24"/>
+        </w:rPr>
+      </w:pPr>
+      <w:r>
+        <w:rPr>
+          <w:rStyle w:val="CommentReference"/>
+        </w:rPr>
+        <w:commentReference w:id="11"/>
+      </w:r>
     </w:p>
     <w:p>
       <w:pPr>
@@ -1894,7 +2493,57 @@
           <w:sz w:val="24"/>
           <w:szCs w:val="24"/>
         </w:rPr>
-        <w:t>If You update a button and another user deletes the delete wins</w:t>
+        <w:t xml:space="preserve">If You update a button and another </w:t>
+      </w:r>
+      <w:commentRangeStart w:id="12"/>
+      <w:r>
+        <w:rPr>
+          <w:sz w:val="24"/>
+          <w:szCs w:val="24"/>
+        </w:rPr>
+        <w:t>user deletes</w:t>
+      </w:r>
+      <w:commentRangeEnd w:id="12"/>
+      <w:r>
+        <w:rPr>
+          <w:rStyle w:val="CommentReference"/>
+        </w:rPr>
+        <w:commentReference w:id="12"/>
+      </w:r>
+      <w:r>
+        <w:rPr>
+          <w:sz w:val="24"/>
+          <w:szCs w:val="24"/>
+        </w:rPr>
+        <w:t xml:space="preserve"> it at</w:t>
+      </w:r>
+      <w:r>
+        <w:rPr>
+          <w:sz w:val="24"/>
+          <w:szCs w:val="24"/>
+        </w:rPr>
+        <w:t xml:space="preserve"> </w:t>
+      </w:r>
+      <w:r>
+        <w:rPr>
+          <w:sz w:val="24"/>
+          <w:szCs w:val="24"/>
+        </w:rPr>
+        <w:t>the same time</w:t>
+      </w:r>
+      <w:r>
+        <w:rPr>
+          <w:sz w:val="24"/>
+          <w:szCs w:val="24"/>
+        </w:rPr>
+        <w:t xml:space="preserve"> the delete </w:t>
+      </w:r>
+      <w:r>
+        <w:rPr>
+          <w:sz w:val="24"/>
+          <w:szCs w:val="24"/>
+        </w:rPr>
+        <w:t>Rules</w:t>
       </w:r>
       <w:r>
         <w:rPr>
@@ -1944,7 +2593,14 @@
           <w:sz w:val="24"/>
           <w:szCs w:val="24"/>
         </w:rPr>
-        <w:t xml:space="preserve"> the same button the latest save wins</w:t>
+        <w:t xml:space="preserve"> the same button the latest save </w:t>
+      </w:r>
+      <w:r>
+        <w:rPr>
+          <w:sz w:val="24"/>
+          <w:szCs w:val="24"/>
+        </w:rPr>
+        <w:t>Rules</w:t>
       </w:r>
       <w:r>
         <w:rPr>
@@ -2047,15 +2703,7 @@
           <w:sz w:val="24"/>
           <w:szCs w:val="24"/>
         </w:rPr>
-        <w:t>Always Read pop-ups in order to either know what is wrong or report an issue</w:t>
-      </w:r>
-      <w:r>
-        <w:rPr>
-          <w:color w:val="FF0000"/>
-          <w:sz w:val="24"/>
-          <w:szCs w:val="24"/>
-        </w:rPr>
-        <w:t>.</w:t>
+        <w:t>Always Read pop-ups in order to either know what is wrong or report an issue.</w:t>
       </w:r>
     </w:p>
     <w:p>
@@ -2087,25 +2735,7 @@
           <w:sz w:val="24"/>
           <w:szCs w:val="24"/>
         </w:rPr>
-        <w:t xml:space="preserve">You can’t save a screen without any buttons in it whether an </w:t>
-      </w:r>
-      <w:proofErr w:type="spellStart"/>
-      <w:r>
-        <w:rPr>
-          <w:color w:val="FF0000"/>
-          <w:sz w:val="24"/>
-          <w:szCs w:val="24"/>
-        </w:rPr>
-        <w:t>edit or</w:t>
-      </w:r>
-      <w:proofErr w:type="spellEnd"/>
-      <w:r>
-        <w:rPr>
-          <w:color w:val="FF0000"/>
-          <w:sz w:val="24"/>
-          <w:szCs w:val="24"/>
-        </w:rPr>
-        <w:t xml:space="preserve"> add screen.</w:t>
+        <w:t>You can’t save a screen without any buttons in it whether an edit or add screen.</w:t>
       </w:r>
     </w:p>
     <w:p>
@@ -2179,13 +2809,14 @@
           <w:szCs w:val="24"/>
         </w:rPr>
       </w:pPr>
+      <w:commentRangeStart w:id="13"/>
       <w:r>
         <w:rPr>
           <w:color w:val="FF0000"/>
           <w:sz w:val="24"/>
           <w:szCs w:val="24"/>
         </w:rPr>
-        <w:t xml:space="preserve">If no changes Made on screen or a button pressing save will </w:t>
+        <w:t>If no changes Made on screen or a button</w:t>
       </w:r>
       <w:r>
         <w:rPr>
@@ -2193,42 +2824,79 @@
           <w:sz w:val="24"/>
           <w:szCs w:val="24"/>
         </w:rPr>
-        <w:t>take place.</w:t>
-      </w:r>
-      <w:bookmarkStart w:id="1" w:name="_GoBack"/>
-      <w:bookmarkEnd w:id="1"/>
-    </w:p>
-    <w:p>
-      <w:pPr>
-        <w:pStyle w:val="ListParagraph"/>
+        <w:t>,</w:t>
+      </w:r>
+      <w:r>
         <w:rPr>
           <w:color w:val="FF0000"/>
           <w:sz w:val="24"/>
           <w:szCs w:val="24"/>
         </w:rPr>
-      </w:pPr>
-    </w:p>
-    <w:p>
-      <w:pPr>
-        <w:pStyle w:val="ListParagraph"/>
+        <w:t xml:space="preserve"> pressing save will</w:t>
+      </w:r>
+      <w:r>
         <w:rPr>
           <w:color w:val="FF0000"/>
           <w:sz w:val="24"/>
           <w:szCs w:val="24"/>
         </w:rPr>
-      </w:pPr>
-    </w:p>
-    <w:p>
-      <w:pPr>
-        <w:rPr>
-          <w:sz w:val="24"/>
-          <w:szCs w:val="24"/>
-        </w:rPr>
-      </w:pPr>
-    </w:p>
-    <w:p>
-      <w:pPr>
-        <w:rPr>
+        <w:t xml:space="preserve"> not</w:t>
+      </w:r>
+      <w:r>
+        <w:rPr>
+          <w:color w:val="FF0000"/>
+          <w:sz w:val="24"/>
+          <w:szCs w:val="24"/>
+        </w:rPr>
+        <w:t xml:space="preserve"> </w:t>
+      </w:r>
+      <w:r>
+        <w:rPr>
+          <w:color w:val="FF0000"/>
+          <w:sz w:val="24"/>
+          <w:szCs w:val="24"/>
+        </w:rPr>
+        <w:t>take place</w:t>
+      </w:r>
+      <w:commentRangeEnd w:id="13"/>
+      <w:r>
+        <w:rPr>
+          <w:rStyle w:val="CommentReference"/>
+        </w:rPr>
+        <w:commentReference w:id="13"/>
+      </w:r>
+      <w:r>
+        <w:rPr>
+          <w:color w:val="FF0000"/>
+          <w:sz w:val="24"/>
+          <w:szCs w:val="24"/>
+        </w:rPr>
+        <w:t xml:space="preserve"> since there is nothing that has changed</w:t>
+      </w:r>
+      <w:r>
+        <w:rPr>
+          <w:color w:val="FF0000"/>
+          <w:sz w:val="24"/>
+          <w:szCs w:val="24"/>
+        </w:rPr>
+        <w:t>.</w:t>
+      </w:r>
+    </w:p>
+    <w:p>
+      <w:pPr>
+        <w:pStyle w:val="ListParagraph"/>
+        <w:rPr>
+          <w:color w:val="FF0000"/>
+          <w:sz w:val="24"/>
+          <w:szCs w:val="24"/>
+        </w:rPr>
+      </w:pPr>
+    </w:p>
+    <w:p>
+      <w:pPr>
+        <w:pStyle w:val="ListParagraph"/>
+        <w:rPr>
+          <w:color w:val="FF0000"/>
           <w:sz w:val="24"/>
           <w:szCs w:val="24"/>
         </w:rPr>
@@ -2258,6 +2926,237 @@
     </w:sectPr>
   </w:body>
 </w:document>
+</file>
+
+<file path=word/comments.xml><?xml version="1.0" encoding="utf-8"?>
+<w:comments xmlns:wpc="http://schemas.microsoft.com/office/word/2010/wordprocessingCanvas" xmlns:cx="http://schemas.microsoft.com/office/drawing/2014/chartex" xmlns:cx1="http://schemas.microsoft.com/office/drawing/2015/9/8/chartex" xmlns:cx2="http://schemas.microsoft.com/office/drawing/2015/10/21/chartex" xmlns:cx3="http://schemas.microsoft.com/office/drawing/2016/5/9/chartex" xmlns:cx4="http://schemas.microsoft.com/office/drawing/2016/5/10/chartex" xmlns:cx5="http://schemas.microsoft.com/office/drawing/2016/5/11/chartex" xmlns:cx6="http://schemas.microsoft.com/office/drawing/2016/5/12/chartex" xmlns:cx7="http://schemas.microsoft.com/office/drawing/2016/5/13/chartex" xmlns:cx8="http://schemas.microsoft.com/office/drawing/2016/5/14/chartex" xmlns:mc="http://schemas.openxmlformats.org/markup-compatibility/2006" xmlns:aink="http://schemas.microsoft.com/office/drawing/2016/ink" xmlns:am3d="http://schemas.microsoft.com/office/drawing/2017/model3d" xmlns:o="urn:schemas-microsoft-com:office:office" xmlns:r="http://schemas.openxmlformats.org/officeDocument/2006/relationships" xmlns:m="http://schemas.openxmlformats.org/officeDocument/2006/math" xmlns:v="urn:schemas-microsoft-com:vml" xmlns:wp14="http://schemas.microsoft.com/office/word/2010/wordprocessingDrawing" xmlns:wp="http://schemas.openxmlformats.org/drawingml/2006/wordprocessingDrawing" xmlns:w10="urn:schemas-microsoft-com:office:word" xmlns:w="http://schemas.openxmlformats.org/wordprocessingml/2006/main" xmlns:w14="http://schemas.microsoft.com/office/word/2010/wordml" xmlns:w15="http://schemas.microsoft.com/office/word/2012/wordml" xmlns:w16cid="http://schemas.microsoft.com/office/word/2016/wordml/cid" xmlns:w16se="http://schemas.microsoft.com/office/word/2015/wordml/symex" xmlns:wpg="http://schemas.microsoft.com/office/word/2010/wordprocessingGroup" xmlns:wpi="http://schemas.microsoft.com/office/word/2010/wordprocessingInk" xmlns:wne="http://schemas.microsoft.com/office/word/2006/wordml" xmlns:wps="http://schemas.microsoft.com/office/word/2010/wordprocessingShape" mc:Ignorable="w14 w15 w16se w16cid wp14">
+  <w:comment w:id="0" w:author="Noor Abdulhameed" w:date="2026-07-30T18:46:00Z" w:initials="NA">
+    <w:p>
+      <w:pPr>
+        <w:pStyle w:val="CommentText"/>
+      </w:pPr>
+      <w:r>
+        <w:rPr>
+          <w:rStyle w:val="CommentReference"/>
+        </w:rPr>
+        <w:annotationRef/>
+      </w:r>
+      <w:r>
+        <w:t>There are multiple grammatical errors in the file</w:t>
+      </w:r>
+    </w:p>
+  </w:comment>
+  <w:comment w:id="1" w:author="Noor Abdulhameed" w:date="2026-07-30T18:42:00Z" w:initials="NA">
+    <w:p>
+      <w:pPr>
+        <w:pStyle w:val="CommentText"/>
+      </w:pPr>
+      <w:r>
+        <w:rPr>
+          <w:rStyle w:val="CommentReference"/>
+        </w:rPr>
+        <w:annotationRef/>
+      </w:r>
+      <w:r>
+        <w:t>You did not add a summary about what this app purpose is</w:t>
+      </w:r>
+    </w:p>
+  </w:comment>
+  <w:comment w:id="4" w:author="Noor Abdulhameed" w:date="2026-07-30T18:38:00Z" w:initials="NA">
+    <w:p>
+      <w:pPr>
+        <w:pStyle w:val="CommentText"/>
+      </w:pPr>
+      <w:r>
+        <w:rPr>
+          <w:rStyle w:val="CommentReference"/>
+        </w:rPr>
+        <w:annotationRef/>
+      </w:r>
+      <w:r>
+        <w:t>It would be better to generate a folder for deployment, the person running the app is not the same as the one who built the app.</w:t>
+      </w:r>
+    </w:p>
+  </w:comment>
+  <w:comment w:id="3" w:author="Noor Abdulhameed" w:date="2026-07-30T18:37:00Z" w:initials="NA">
+    <w:p>
+      <w:pPr>
+        <w:pStyle w:val="CommentText"/>
+      </w:pPr>
+      <w:r>
+        <w:rPr>
+          <w:rStyle w:val="CommentReference"/>
+        </w:rPr>
+        <w:annotationRef/>
+      </w:r>
+      <w:r>
+        <w:t>How can they execute it? Using what, what to expect after execution</w:t>
+      </w:r>
+    </w:p>
+  </w:comment>
+  <w:comment w:id="5" w:author="Noor Abdulhameed" w:date="2026-07-30T18:39:00Z" w:initials="NA">
+    <w:p>
+      <w:pPr>
+        <w:pStyle w:val="CommentText"/>
+      </w:pPr>
+      <w:r>
+        <w:rPr>
+          <w:rStyle w:val="CommentReference"/>
+        </w:rPr>
+        <w:annotationRef/>
+      </w:r>
+      <w:r>
+        <w:t>Refer to “deployment folder”</w:t>
+      </w:r>
+    </w:p>
+  </w:comment>
+  <w:comment w:id="6" w:author="Noor Abdulhameed" w:date="2026-07-30T18:40:00Z" w:initials="NA">
+    <w:p>
+      <w:pPr>
+        <w:pStyle w:val="CommentText"/>
+      </w:pPr>
+      <w:r>
+        <w:rPr>
+          <w:rStyle w:val="CommentReference"/>
+        </w:rPr>
+        <w:annotationRef/>
+      </w:r>
+      <w:r>
+        <w:t>“true” and “false” are also accepted</w:t>
+      </w:r>
+    </w:p>
+  </w:comment>
+  <w:comment w:id="7" w:author="Noor Abdulhameed" w:date="2026-07-30T18:41:00Z" w:initials="NA">
+    <w:p>
+      <w:pPr>
+        <w:pStyle w:val="CommentText"/>
+      </w:pPr>
+      <w:r>
+        <w:rPr>
+          <w:rStyle w:val="CommentReference"/>
+        </w:rPr>
+        <w:annotationRef/>
+      </w:r>
+      <w:r>
+        <w:t>What should we run to open the app?</w:t>
+      </w:r>
+    </w:p>
+  </w:comment>
+  <w:comment w:id="8" w:author="Noor Abdulhameed" w:date="2026-07-30T18:42:00Z" w:initials="NA">
+    <w:p>
+      <w:pPr>
+        <w:pStyle w:val="CommentText"/>
+      </w:pPr>
+      <w:r>
+        <w:rPr>
+          <w:rStyle w:val="CommentReference"/>
+        </w:rPr>
+        <w:annotationRef/>
+      </w:r>
+      <w:r>
+        <w:t>It would be better to have the user enters a name rather than ID</w:t>
+      </w:r>
+    </w:p>
+  </w:comment>
+  <w:comment w:id="10" w:author="Noor Abdulhameed" w:date="2026-07-30T18:44:00Z" w:initials="NA">
+    <w:p>
+      <w:pPr>
+        <w:pStyle w:val="CommentText"/>
+      </w:pPr>
+      <w:r>
+        <w:rPr>
+          <w:rStyle w:val="CommentReference"/>
+        </w:rPr>
+        <w:annotationRef/>
+      </w:r>
+      <w:r>
+        <w:t>Before saving what?</w:t>
+      </w:r>
+    </w:p>
+  </w:comment>
+  <w:comment w:id="11" w:author="Noor Abdulhameed" w:date="2026-07-30T18:44:00Z" w:initials="NA">
+    <w:p>
+      <w:pPr>
+        <w:pStyle w:val="CommentText"/>
+      </w:pPr>
+      <w:r>
+        <w:rPr>
+          <w:rStyle w:val="CommentReference"/>
+        </w:rPr>
+        <w:annotationRef/>
+      </w:r>
+      <w:r>
+        <w:t>Not clear</w:t>
+      </w:r>
+    </w:p>
+  </w:comment>
+  <w:comment w:id="12" w:author="Noor Abdulhameed" w:date="2026-07-30T18:44:00Z" w:initials="NA">
+    <w:p>
+      <w:pPr>
+        <w:pStyle w:val="CommentText"/>
+      </w:pPr>
+      <w:r>
+        <w:rPr>
+          <w:rStyle w:val="CommentReference"/>
+        </w:rPr>
+        <w:annotationRef/>
+      </w:r>
+      <w:r>
+        <w:t>When?</w:t>
+      </w:r>
+    </w:p>
+  </w:comment>
+  <w:comment w:id="13" w:author="Noor Abdulhameed" w:date="2026-07-30T18:45:00Z" w:initials="NA">
+    <w:p>
+      <w:pPr>
+        <w:pStyle w:val="CommentText"/>
+      </w:pPr>
+      <w:r>
+        <w:rPr>
+          <w:rStyle w:val="CommentReference"/>
+        </w:rPr>
+        <w:annotationRef/>
+      </w:r>
+      <w:r>
+        <w:t>Not clear</w:t>
+      </w:r>
+    </w:p>
+  </w:comment>
+</w:comments>
+</file>
+
+<file path=word/commentsExtended.xml><?xml version="1.0" encoding="utf-8"?>
+<w15:commentsEx xmlns:wpc="http://schemas.microsoft.com/office/word/2010/wordprocessingCanvas" xmlns:cx="http://schemas.microsoft.com/office/drawing/2014/chartex" xmlns:cx1="http://schemas.microsoft.com/office/drawing/2015/9/8/chartex" xmlns:cx2="http://schemas.microsoft.com/office/drawing/2015/10/21/chartex" xmlns:cx3="http://schemas.microsoft.com/office/drawing/2016/5/9/chartex" xmlns:cx4="http://schemas.microsoft.com/office/drawing/2016/5/10/chartex" xmlns:cx5="http://schemas.microsoft.com/office/drawing/2016/5/11/chartex" xmlns:cx6="http://schemas.microsoft.com/office/drawing/2016/5/12/chartex" xmlns:cx7="http://schemas.microsoft.com/office/drawing/2016/5/13/chartex" xmlns:cx8="http://schemas.microsoft.com/office/drawing/2016/5/14/chartex" xmlns:mc="http://schemas.openxmlformats.org/markup-compatibility/2006" xmlns:aink="http://schemas.microsoft.com/office/drawing/2016/ink" xmlns:am3d="http://schemas.microsoft.com/office/drawing/2017/model3d" xmlns:o="urn:schemas-microsoft-com:office:office" xmlns:r="http://schemas.openxmlformats.org/officeDocument/2006/relationships" xmlns:m="http://schemas.openxmlformats.org/officeDocument/2006/math" xmlns:v="urn:schemas-microsoft-com:vml" xmlns:wp14="http://schemas.microsoft.com/office/word/2010/wordprocessingDrawing" xmlns:wp="http://schemas.openxmlformats.org/drawingml/2006/wordprocessingDrawing" xmlns:w10="urn:schemas-microsoft-com:office:word" xmlns:w="http://schemas.openxmlformats.org/wordprocessingml/2006/main" xmlns:w14="http://schemas.microsoft.com/office/word/2010/wordml" xmlns:w15="http://schemas.microsoft.com/office/word/2012/wordml" xmlns:w16cid="http://schemas.microsoft.com/office/word/2016/wordml/cid" xmlns:w16se="http://schemas.microsoft.com/office/word/2015/wordml/symex" xmlns:wpg="http://schemas.microsoft.com/office/word/2010/wordprocessingGroup" xmlns:wpi="http://schemas.microsoft.com/office/word/2010/wordprocessingInk" xmlns:wne="http://schemas.microsoft.com/office/word/2006/wordml" xmlns:wps="http://schemas.microsoft.com/office/word/2010/wordprocessingShape" mc:Ignorable="w14 w15 w16se w16cid wp14">
+  <w15:commentEx w15:paraId="2AE4B240" w15:done="1"/>
+  <w15:commentEx w15:paraId="14F4FBBC" w15:done="1"/>
+  <w15:commentEx w15:paraId="1B21FBCA" w15:done="1"/>
+  <w15:commentEx w15:paraId="01C542E9" w15:done="1"/>
+  <w15:commentEx w15:paraId="07A4A5E9" w15:done="1"/>
+  <w15:commentEx w15:paraId="4B152DCD" w15:done="1"/>
+  <w15:commentEx w15:paraId="1953593B" w15:done="1"/>
+  <w15:commentEx w15:paraId="57E609E1" w15:done="1"/>
+  <w15:commentEx w15:paraId="5A2A3727" w15:done="1"/>
+  <w15:commentEx w15:paraId="23A3F500" w15:done="1"/>
+  <w15:commentEx w15:paraId="39A9D933" w15:done="1"/>
+  <w15:commentEx w15:paraId="4B54201B" w15:done="1"/>
+</w15:commentsEx>
+</file>
+
+<file path=word/commentsIds.xml><?xml version="1.0" encoding="utf-8"?>
+<w16cid:commentsIds xmlns:wpc="http://schemas.microsoft.com/office/word/2010/wordprocessingCanvas" xmlns:cx="http://schemas.microsoft.com/office/drawing/2014/chartex" xmlns:cx1="http://schemas.microsoft.com/office/drawing/2015/9/8/chartex" xmlns:cx2="http://schemas.microsoft.com/office/drawing/2015/10/21/chartex" xmlns:cx3="http://schemas.microsoft.com/office/drawing/2016/5/9/chartex" xmlns:cx4="http://schemas.microsoft.com/office/drawing/2016/5/10/chartex" xmlns:cx5="http://schemas.microsoft.com/office/drawing/2016/5/11/chartex" xmlns:cx6="http://schemas.microsoft.com/office/drawing/2016/5/12/chartex" xmlns:cx7="http://schemas.microsoft.com/office/drawing/2016/5/13/chartex" xmlns:cx8="http://schemas.microsoft.com/office/drawing/2016/5/14/chartex" xmlns:mc="http://schemas.openxmlformats.org/markup-compatibility/2006" xmlns:aink="http://schemas.microsoft.com/office/drawing/2016/ink" xmlns:am3d="http://schemas.microsoft.com/office/drawing/2017/model3d" xmlns:o="urn:schemas-microsoft-com:office:office" xmlns:r="http://schemas.openxmlformats.org/officeDocument/2006/relationships" xmlns:m="http://schemas.openxmlformats.org/officeDocument/2006/math" xmlns:v="urn:schemas-microsoft-com:vml" xmlns:wp14="http://schemas.microsoft.com/office/word/2010/wordprocessingDrawing" xmlns:wp="http://schemas.openxmlformats.org/drawingml/2006/wordprocessingDrawing" xmlns:w10="urn:schemas-microsoft-com:office:word" xmlns:w="http://schemas.openxmlformats.org/wordprocessingml/2006/main" xmlns:w14="http://schemas.microsoft.com/office/word/2010/wordml" xmlns:w15="http://schemas.microsoft.com/office/word/2012/wordml" xmlns:w16cid="http://schemas.microsoft.com/office/word/2016/wordml/cid" xmlns:w16se="http://schemas.microsoft.com/office/word/2015/wordml/symex" xmlns:wpg="http://schemas.microsoft.com/office/word/2010/wordprocessingGroup" xmlns:wpi="http://schemas.microsoft.com/office/word/2010/wordprocessingInk" xmlns:wne="http://schemas.microsoft.com/office/word/2006/wordml" xmlns:wps="http://schemas.microsoft.com/office/word/2010/wordprocessingShape" mc:Ignorable="w14 w15 w16se w16cid wp14">
+  <w16cid:commentId w16cid:paraId="2AE4B240" w16cid:durableId="2E1AF2B6"/>
+  <w16cid:commentId w16cid:paraId="14F4FBBC" w16cid:durableId="2E1AF2B7"/>
+  <w16cid:commentId w16cid:paraId="1B21FBCA" w16cid:durableId="2E1AF2B8"/>
+  <w16cid:commentId w16cid:paraId="01C542E9" w16cid:durableId="2E1AF2B9"/>
+  <w16cid:commentId w16cid:paraId="07A4A5E9" w16cid:durableId="2E1AF2BA"/>
+  <w16cid:commentId w16cid:paraId="4B152DCD" w16cid:durableId="2E1AF2BD"/>
+  <w16cid:commentId w16cid:paraId="1953593B" w16cid:durableId="2E1AF2BE"/>
+  <w16cid:commentId w16cid:paraId="57E609E1" w16cid:durableId="2E1AF2BF"/>
+  <w16cid:commentId w16cid:paraId="5A2A3727" w16cid:durableId="2E1AF2C0"/>
+  <w16cid:commentId w16cid:paraId="23A3F500" w16cid:durableId="2E1AF2C1"/>
+  <w16cid:commentId w16cid:paraId="39A9D933" w16cid:durableId="2E1AF2C2"/>
+  <w16cid:commentId w16cid:paraId="4B54201B" w16cid:durableId="2E1AF2C4"/>
+</w16cid:commentsIds>
 </file>
 
 <file path=word/numbering.xml><?xml version="1.0" encoding="utf-8"?>
@@ -3020,6 +3919,14 @@
     <w:abstractNumId w:val="6"/>
   </w:num>
 </w:numbering>
+</file>
+
+<file path=word/people.xml><?xml version="1.0" encoding="utf-8"?>
+<w15:people xmlns:wpc="http://schemas.microsoft.com/office/word/2010/wordprocessingCanvas" xmlns:cx="http://schemas.microsoft.com/office/drawing/2014/chartex" xmlns:cx1="http://schemas.microsoft.com/office/drawing/2015/9/8/chartex" xmlns:cx2="http://schemas.microsoft.com/office/drawing/2015/10/21/chartex" xmlns:cx3="http://schemas.microsoft.com/office/drawing/2016/5/9/chartex" xmlns:cx4="http://schemas.microsoft.com/office/drawing/2016/5/10/chartex" xmlns:cx5="http://schemas.microsoft.com/office/drawing/2016/5/11/chartex" xmlns:cx6="http://schemas.microsoft.com/office/drawing/2016/5/12/chartex" xmlns:cx7="http://schemas.microsoft.com/office/drawing/2016/5/13/chartex" xmlns:cx8="http://schemas.microsoft.com/office/drawing/2016/5/14/chartex" xmlns:mc="http://schemas.openxmlformats.org/markup-compatibility/2006" xmlns:aink="http://schemas.microsoft.com/office/drawing/2016/ink" xmlns:am3d="http://schemas.microsoft.com/office/drawing/2017/model3d" xmlns:o="urn:schemas-microsoft-com:office:office" xmlns:r="http://schemas.openxmlformats.org/officeDocument/2006/relationships" xmlns:m="http://schemas.openxmlformats.org/officeDocument/2006/math" xmlns:v="urn:schemas-microsoft-com:vml" xmlns:wp14="http://schemas.microsoft.com/office/word/2010/wordprocessingDrawing" xmlns:wp="http://schemas.openxmlformats.org/drawingml/2006/wordprocessingDrawing" xmlns:w10="urn:schemas-microsoft-com:office:word" xmlns:w="http://schemas.openxmlformats.org/wordprocessingml/2006/main" xmlns:w14="http://schemas.microsoft.com/office/word/2010/wordml" xmlns:w15="http://schemas.microsoft.com/office/word/2012/wordml" xmlns:w16cid="http://schemas.microsoft.com/office/word/2016/wordml/cid" xmlns:w16se="http://schemas.microsoft.com/office/word/2015/wordml/symex" xmlns:wpg="http://schemas.microsoft.com/office/word/2010/wordprocessingGroup" xmlns:wpi="http://schemas.microsoft.com/office/word/2010/wordprocessingInk" xmlns:wne="http://schemas.microsoft.com/office/word/2006/wordml" xmlns:wps="http://schemas.microsoft.com/office/word/2010/wordprocessingShape" mc:Ignorable="w14 w15 w16se w16cid wp14">
+  <w15:person w15:author="Noor Abdulhameed">
+    <w15:presenceInfo w15:providerId="AD" w15:userId="S-1-5-21-3199550461-3879177782-2089355075-1235"/>
+  </w15:person>
+</w15:people>
 </file>
 
 <file path=word/styles.xml><?xml version="1.0" encoding="utf-8"?>
@@ -3145,7 +4052,6 @@
     <w:lsdException w:name="HTML Sample" w:semiHidden="1" w:unhideWhenUsed="1"/>
     <w:lsdException w:name="HTML Typewriter" w:semiHidden="1" w:unhideWhenUsed="1"/>
     <w:lsdException w:name="HTML Variable" w:semiHidden="1" w:unhideWhenUsed="1"/>
-    <w:lsdException w:name="Normal Table" w:semiHidden="1" w:unhideWhenUsed="1"/>
     <w:lsdException w:name="annotation subject" w:semiHidden="1" w:unhideWhenUsed="1"/>
     <w:lsdException w:name="No List" w:semiHidden="1" w:unhideWhenUsed="1"/>
     <w:lsdException w:name="Outline List 1" w:semiHidden="1" w:unhideWhenUsed="1"/>
@@ -3189,10 +4095,8 @@
     <w:lsdException w:name="Table Elegant" w:semiHidden="1" w:unhideWhenUsed="1"/>
     <w:lsdException w:name="Table Professional" w:semiHidden="1" w:unhideWhenUsed="1"/>
     <w:lsdException w:name="Table Subtle 1" w:semiHidden="1" w:unhideWhenUsed="1"/>
-    <w:lsdException w:name="Table Subtle 2" w:semiHidden="1" w:unhideWhenUsed="1"/>
     <w:lsdException w:name="Table Web 1" w:semiHidden="1" w:unhideWhenUsed="1"/>
     <w:lsdException w:name="Table Web 2" w:semiHidden="1" w:unhideWhenUsed="1"/>
-    <w:lsdException w:name="Table Web 3" w:semiHidden="1" w:unhideWhenUsed="1"/>
     <w:lsdException w:name="Balloon Text" w:semiHidden="1" w:unhideWhenUsed="1"/>
     <w:lsdException w:name="Table Grid" w:uiPriority="39"/>
     <w:lsdException w:name="Table Theme" w:semiHidden="1" w:unhideWhenUsed="1"/>
@@ -3556,6 +4460,74 @@
       <w:szCs w:val="18"/>
     </w:rPr>
   </w:style>
+  <w:style w:type="character" w:styleId="CommentReference">
+    <w:name w:val="annotation reference"/>
+    <w:basedOn w:val="DefaultParagraphFont"/>
+    <w:uiPriority w:val="99"/>
+    <w:semiHidden/>
+    <w:unhideWhenUsed/>
+    <w:rsid w:val="000338C5"/>
+    <w:rPr>
+      <w:sz w:val="16"/>
+      <w:szCs w:val="16"/>
+    </w:rPr>
+  </w:style>
+  <w:style w:type="paragraph" w:styleId="CommentText">
+    <w:name w:val="annotation text"/>
+    <w:basedOn w:val="Normal"/>
+    <w:link w:val="CommentTextChar"/>
+    <w:uiPriority w:val="99"/>
+    <w:semiHidden/>
+    <w:unhideWhenUsed/>
+    <w:rsid w:val="000338C5"/>
+    <w:pPr>
+      <w:spacing w:line="240" w:lineRule="auto"/>
+    </w:pPr>
+    <w:rPr>
+      <w:sz w:val="20"/>
+      <w:szCs w:val="20"/>
+    </w:rPr>
+  </w:style>
+  <w:style w:type="character" w:customStyle="1" w:styleId="CommentTextChar">
+    <w:name w:val="Comment Text Char"/>
+    <w:basedOn w:val="DefaultParagraphFont"/>
+    <w:link w:val="CommentText"/>
+    <w:uiPriority w:val="99"/>
+    <w:semiHidden/>
+    <w:rsid w:val="000338C5"/>
+    <w:rPr>
+      <w:sz w:val="20"/>
+      <w:szCs w:val="20"/>
+    </w:rPr>
+  </w:style>
+  <w:style w:type="paragraph" w:styleId="CommentSubject">
+    <w:name w:val="annotation subject"/>
+    <w:basedOn w:val="CommentText"/>
+    <w:next w:val="CommentText"/>
+    <w:link w:val="CommentSubjectChar"/>
+    <w:uiPriority w:val="99"/>
+    <w:semiHidden/>
+    <w:unhideWhenUsed/>
+    <w:rsid w:val="000338C5"/>
+    <w:rPr>
+      <w:b/>
+      <w:bCs/>
+    </w:rPr>
+  </w:style>
+  <w:style w:type="character" w:customStyle="1" w:styleId="CommentSubjectChar">
+    <w:name w:val="Comment Subject Char"/>
+    <w:basedOn w:val="CommentTextChar"/>
+    <w:link w:val="CommentSubject"/>
+    <w:uiPriority w:val="99"/>
+    <w:semiHidden/>
+    <w:rsid w:val="000338C5"/>
+    <w:rPr>
+      <w:b/>
+      <w:bCs/>
+      <w:sz w:val="20"/>
+      <w:szCs w:val="20"/>
+    </w:rPr>
+  </w:style>
 </w:styles>
 </file>
 

</xml_diff>